<commit_message>
Clarify report figure interpretations
Explain figure axes, colors, network encodings, and the limits of significance claims in plain language.\n\nCo-authored-by: Copilot <223556219+Copilot@users.noreply.github.com>
</commit_message>
<xml_diff>
--- a/methods_and_results.docx
+++ b/methods_and_results.docx
@@ -180,7 +180,7 @@
     </w:p>
     <w:p>
       <w:r>
-        <w:t>Figure 1 summarizes the final classification decisions on the 20% held-out test set. The diagonal counts show 420 correctly classified controls and 264 correctly classified cases, while the off-diagonal counts quantify the 116 classification errors.</w:t>
+        <w:t>Figure 1 is a confusion matrix for the held-out test samples. The horizontal axis shows the model prediction (control or case), and the vertical axis shows the true recorded phenotype; each cell contains the number of samples in that category. Darker/larger counts on the diagonal are correct predictions, while off-diagonal cells are errors: 53 controls were called cases and 63 cases were called controls. This figure is descriptive; it does not itself provide a p-value or prove statistical significance.</w:t>
       </w:r>
     </w:p>
     <w:p>
@@ -237,7 +237,7 @@
     </w:p>
     <w:p>
       <w:r>
-        <w:t>Figure 2 shows the 20 features with the largest absolute standardized coefficients. Protein features and demographic/site covariates are displayed together, illustrating which measured signals contributed most strongly to the case/control prediction.</w:t>
+        <w:t>Figure 2 is a horizontal bar chart of the 20 largest absolute logistic-regression coefficients. The horizontal axis is the standardized coefficient: bars to the right increase predicted case probability, while bars to the left decrease it; the vertical axis lists proteins or covariates. Longer bars indicate stronger model association after adjustment for the other features, but they are not p-values and should not be called statistically significant without confidence intervals or a formal multiple-testing procedure.</w:t>
       </w:r>
     </w:p>
     <w:p>
@@ -294,7 +294,7 @@
     </w:p>
     <w:p>
       <w:r>
-        <w:t>Figure 3 ranks proteins by haplograph degree, defined here as the number of annotated haplograph edge records associated with a protein. This is a network-centrality view and does not imply that these proteins are the strongest phenotype predictors.</w:t>
+        <w:t>Figure 3 is a ranked bar chart of the most connected proteins. The horizontal axis is haplograph degree, meaning the number of annotated haplograph edge records associated with each protein, and the vertical axis lists the protein or gene symbol. A longer bar means greater network connectivity; it does not mean higher expression or stronger disease prediction, and no statistical significance test is shown.</w:t>
       </w:r>
     </w:p>
     <w:p>
@@ -351,7 +351,7 @@
     </w:p>
     <w:p>
       <w:r>
-        <w:t>Figure 4 compares graph degree with the difference in mean log2 abundance between phenotype groups. Point color indicates the absolute injected phenotype effect, allowing network connectivity and measured phenotype signal to be viewed simultaneously.</w:t>
+        <w:t>Figure 4 is a scatter plot linking graph structure to measured proteomics. The x-axis shows haplograph degree on a logarithmic scale, so equal distances represent multiplicative rather than equal changes in degree; the y-axis shows the mean log2 expression difference between phenotype 1 and phenotype 0. Each point is one protein. Point color represents the absolute injected phenotype effect, with stronger color meaning a larger simulated effect. The plot is exploratory: the color scale is not a significance test, and the observed relationship is not interpreted as significant without a prespecified statistical test and confidence interval.</w:t>
       </w:r>
     </w:p>
     <w:p>
@@ -408,7 +408,7 @@
     </w:p>
     <w:p>
       <w:r>
-        <w:t>Figure 5 displays an interpretable high-degree subgraph of the large haplograph. Node size represents degree, edge width represents the logarithm of co-occurrence weight, and edge color represents lift, so stronger-than-expected associations are visible without plotting all hundreds of thousands of edges.</w:t>
+        <w:t>Figure 5 is a network drawing of the highest-degree haploblocks, selected to make the large graph readable. Each circle is a haploblock node; larger circles mean higher degree within the selected subgraph. Lines are co-occurrence relationships: thicker lines mean larger co-occurrence weight, and greener/yellower lines mean higher lift, or stronger enrichment above chance expectation. Lift greater than 1 indicates more co-occurrence than the independence expectation, but this figure does not display p-values or confidence intervals.</w:t>
       </w:r>
     </w:p>
     <w:p>
@@ -465,7 +465,7 @@
     </w:p>
     <w:p>
       <w:r>
-        <w:t>Figure 6 adds protein nodes to selected haploblocks through genomic membership edges. Haploblocks are shown as squares and proteins as circles; protein color represents the phenotype-associated abundance difference, linking genomic network structure to measured proteomic behavior.</w:t>
+        <w:t>Figure 6 is the integrated haploblock–proteomics network. Squares are haploblocks and circles are proteins; grey lines show that a protein maps to or overlaps a haploblock, while orange lines show haploblock co-occurrence. Protein color represents the difference in mean log2 abundance between phenotype groups, with opposite colors indicating opposite directions of difference. Node colors and line widths are visual encodings, not tests of statistical significance; they show how genomic connectivity and proteomic signal can be viewed together.</w:t>
       </w:r>
     </w:p>
     <w:p>
@@ -522,7 +522,7 @@
     </w:p>
     <w:p>
       <w:r>
-        <w:t>Figure 7 directly compares haplograph degree with the absolute protein coefficient from logistic regression. The weak association and low top-20 overlap support the conclusion that genomic network centrality and predictive proteomic importance describe complementary properties.</w:t>
+        <w:t>Figure 7 compares network connectivity with predictive importance. The x-axis is haplograph degree on a logarithmic scale, and the y-axis is the absolute standardized protein coefficient from logistic regression, also shown on a logarithmic scale; each point is one matched protein. Points farther up have stronger model influence regardless of direction, while points farther right are more network-connected. The weak correlation and only 2-of-20 top-protein overlap indicate different rankings, but this plot alone does not establish statistical significance.</w:t>
       </w:r>
     </w:p>
     <w:p>

</xml_diff>